<commit_message>
Updated Report page and added project assets including resume updates
</commit_message>
<xml_diff>
--- a/assests/Alex Gomez Resume 2026 Q2.docx
+++ b/assests/Alex Gomez Resume 2026 Q2.docx
@@ -245,7 +245,7 @@
         </w:rPr>
         <w:t xml:space="preserve"> </w:t>
       </w:r>
-      <w:hyperlink r:id="R01c3c9e3f1464fbb">
+      <w:hyperlink r:id="Rc5b49368fc1c43a3">
         <w:r>
           <w:rPr>
             <w:rStyle w:val="Hyperlink"/>
@@ -294,7 +294,7 @@
         </w:rPr>
         <w:t xml:space="preserve"> </w:t>
       </w:r>
-      <w:hyperlink r:id="R65414c5de2844d71">
+      <w:hyperlink r:id="Rb904ab49e0e44a20">
         <w:r>
           <w:rPr>
             <w:rStyle w:val="Hyperlink"/>
@@ -480,8 +480,11 @@
         <w:br/>
       </w:r>
     </w:p>
-    <w:p/>
-    <w:p/>
+    <w:p>
+      <w:pPr>
+        <w:pStyle w:val="Normal"/>
+      </w:pPr>
+    </w:p>
     <w:p>
       <w:pPr>
         <w:spacing w:line="360" w:lineRule="auto"/>
@@ -1380,13 +1383,6 @@
         </w:rPr>
         <w:t>Conducted statistical analysis of HIV research data using R and SAS</w:t>
       </w:r>
-    </w:p>
-    <w:p>
-      <w:pPr>
-        <w:rPr>
-          <w:rFonts w:ascii="Calibri" w:hAnsi="Calibri" w:cs="Calibri"/>
-        </w:rPr>
-      </w:pPr>
     </w:p>
     <w:p>
       <w:pPr>

</xml_diff>